<commit_message>
Aumentar límite de correos en inbox, paginación completa y optimización de escaneo
</commit_message>
<xml_diff>
--- a/inbox-app/public/templates/italia.docx
+++ b/inbox-app/public/templates/italia.docx
@@ -959,22 +959,6 @@
                 <w:szCs w:val="20"/>
               </w:rPr>
               <w:t>{{authority}}</w:t>
-            </w:r>
-            <w:r>
-              <w:rPr>
-                <w:rStyle w:val="Strong"/>
-                <w:rFonts w:ascii="LiberationSerif-Italic" w:hAnsi="LiberationSerif-Italic"/>
-                <w:b w:val="false"/>
-                <w:i w:val="false"/>
-                <w:iCs w:val="false"/>
-                <w:caps w:val="false"/>
-                <w:smallCaps w:val="false"/>
-                <w:color w:val="000000"/>
-                <w:spacing w:val="0"/>
-                <w:sz w:val="20"/>
-                <w:szCs w:val="20"/>
-              </w:rPr>
-              <w:t>, Italy</w:t>
             </w:r>
           </w:p>
         </w:tc>

</xml_diff>